<commit_message>
Updated the format for trainee's appointment letter
</commit_message>
<xml_diff>
--- a/samples/sample_document_for_trainee_placeholder.docx
+++ b/samples/sample_document_for_trainee_placeholder.docx
@@ -281,7 +281,9 @@
     </w:p>
     <w:p>
       <w:pPr>
-        <w:jc w:val="both"/>
+        <w:rPr>
+          <w:lang w:val="en-IN"/>
+        </w:rPr>
       </w:pPr>
       <w:r>
         <w:t xml:space="preserve">You are appointed as a </w:t>
@@ -326,8 +328,34 @@
         <w:t>stipend of INR 15,000/- (Rupees Fifteen Thousand only) per month</w:t>
       </w:r>
       <w:r>
-        <w:t>. The monthly remuneration for each calendar month shall be paid within the first week of the immediately succeeding month. In the event an individual joins on or before the 24th day of the calendar month, remuneration for such month shall be paid in the first week of the following month. Where the date of joining is after the 24th day of a calendar month, the remuneration accrued for the partial month, and the subsequent month shall be paid together in the first week of the next succeeding month.</w:t>
-      </w:r>
+        <w:t>. The monthly remuneration for each calendar month shall be paid within the first week of the immediately succeeding month. In the event an individual joins on or before the 24th day of the calendar month, remuneration for such month shall be paid in the first week of the following month. Where the date of joining is after the 24th day of a calendar month, the remuneration accrued for the partial month and the subsequent month shall be paid together in the first week of the next succeeding month</w:t>
+      </w:r>
+      <w:r>
+        <w:t xml:space="preserve">. </w:t>
+      </w:r>
+      <w:r>
+        <w:rPr>
+          <w:lang w:val="en-IN"/>
+        </w:rPr>
+        <w:t>Nothing contained herein shall be construed as creating a</w:t>
+      </w:r>
+      <w:r>
+        <w:rPr>
+          <w:lang w:val="en-IN"/>
+        </w:rPr>
+        <w:t>n</w:t>
+      </w:r>
+      <w:r>
+        <w:rPr>
+          <w:lang w:val="en-IN"/>
+        </w:rPr>
+        <w:t xml:space="preserve"> employer–employee relationship during the training period. </w:t>
+      </w:r>
+    </w:p>
+    <w:p>
+      <w:pPr>
+        <w:jc w:val="both"/>
+      </w:pPr>
     </w:p>
     <w:p>
       <w:pPr>
@@ -397,7 +425,11 @@
         <w:jc w:val="both"/>
       </w:pPr>
       <w:r>
-        <w:t>A Certificate of Training shall be issued only upon your successful completion of six (6) months of continuous training as a Trainee.</w:t>
+        <w:t xml:space="preserve">A Certificate of Training shall be issued only upon your successful completion of six (6) months of </w:t>
+      </w:r>
+      <w:r>
+        <w:lastRenderedPageBreak/>
+        <w:t>continuous training as a Trainee.</w:t>
       </w:r>
     </w:p>
     <w:p>
@@ -584,7 +616,21 @@
           <w:sz w:val="22"/>
           <w:szCs w:val="22"/>
         </w:rPr>
-        <w:t xml:space="preserve"> but the Company may, at its sole discretion, depute, assign, and/or transfer you (or your employment) to any other office of the Company in India or overseas or to any affiliate of the Company as it may deem appropriate. In such case, you shall also be bound by any policy of such other office or affiliate, in existence at the date of this agreement or that may be subsequently framed by the Company or the affiliate. You shall be required to travel to other locations or client sites as reasonably necessary to fulfill your responsibilities. You shall be required to work a minimum of nine (9) hours (including 45 minutes of break) for five (5) days a week. The Company may require reasonable flexibility in your working hours based on business or project needs. Saturday and Sundays are generally non-working days and in case of necessity to meet business requirements, you shall be required</w:t>
+        <w:t xml:space="preserve"> but the Company may, at its sole discretion, depute, assign, and/or transfer you (or your </w:t>
+      </w:r>
+      <w:r>
+        <w:rPr>
+          <w:sz w:val="22"/>
+          <w:szCs w:val="22"/>
+        </w:rPr>
+        <w:t>training/</w:t>
+      </w:r>
+      <w:r>
+        <w:rPr>
+          <w:sz w:val="22"/>
+          <w:szCs w:val="22"/>
+        </w:rPr>
+        <w:t>employment) to any other office of the Company in India or overseas or to any affiliate of the Company as it may deem appropriate. In such case, you shall also be bound by any policy of such other office or affiliate, in existence at the date of this agreement or that may be subsequently framed by the Company or the affiliate. You shall be required to travel to other locations or client sites as reasonably necessary to fulfill your responsibilities. You shall be required to work a minimum of nine (9) hours (including 45 minutes of break) for five (5) days a week. The Company may require reasonable flexibility in your working hours based on business or project needs. Saturday and Sundays are generally non-working days and in case of necessity to meet business requirements, you shall be required</w:t>
       </w:r>
       <w:r>
         <w:rPr>
@@ -830,7 +876,13 @@
         </w:rPr>
       </w:pPr>
       <w:r>
-        <w:t>As a condition of your employment, you will be required to sign the company’s standard form of employee Non-Disclosure and Assignment of Inventions Agreement at the time of your joining and abide by it, which is incorporated herein by this reference. The</w:t>
+        <w:t>As a condition of your</w:t>
+      </w:r>
+      <w:r>
+        <w:t xml:space="preserve"> training</w:t>
+      </w:r>
+      <w:r>
+        <w:t>, you will be required to sign the company’s standard form Non-Disclosure and Assignment of Inventions Agreement at the time of your joining and abide by it, which is incorporated herein by this reference. The</w:t>
       </w:r>
       <w:r>
         <w:rPr>
@@ -896,67 +948,10 @@
         <w:t>copyrights concerning works undertaken</w:t>
       </w:r>
       <w:r>
-        <w:rPr>
-          <w:spacing w:val="-14"/>
-        </w:rPr>
-        <w:t xml:space="preserve"> </w:t>
-      </w:r>
-      <w:r>
-        <w:t>while</w:t>
-      </w:r>
-      <w:r>
-        <w:rPr>
-          <w:spacing w:val="-15"/>
-        </w:rPr>
-        <w:t xml:space="preserve"> </w:t>
-      </w:r>
-      <w:r>
-        <w:t>in</w:t>
-      </w:r>
-      <w:r>
-        <w:rPr>
-          <w:spacing w:val="-14"/>
-        </w:rPr>
-        <w:t xml:space="preserve"> </w:t>
-      </w:r>
-      <w:r>
-        <w:t>the</w:t>
-      </w:r>
-      <w:r>
-        <w:rPr>
-          <w:spacing w:val="-12"/>
-        </w:rPr>
-        <w:t xml:space="preserve"> </w:t>
-      </w:r>
-      <w:r>
-        <w:t>employment</w:t>
-      </w:r>
-      <w:r>
-        <w:rPr>
-          <w:spacing w:val="-13"/>
-        </w:rPr>
-        <w:t xml:space="preserve"> </w:t>
-      </w:r>
-      <w:r>
-        <w:t>of</w:t>
-      </w:r>
-      <w:r>
-        <w:rPr>
-          <w:spacing w:val="-15"/>
-        </w:rPr>
-        <w:t xml:space="preserve"> </w:t>
-      </w:r>
-      <w:r>
-        <w:t>the</w:t>
-      </w:r>
-      <w:r>
-        <w:rPr>
-          <w:spacing w:val="-15"/>
-        </w:rPr>
-        <w:t xml:space="preserve"> </w:t>
-      </w:r>
-      <w:r>
-        <w:t>company.</w:t>
+        <w:t xml:space="preserve"> during the training period</w:t>
+      </w:r>
+      <w:r>
+        <w:t>.</w:t>
       </w:r>
       <w:r>
         <w:rPr>
@@ -1079,7 +1074,11 @@
         <w:jc w:val="both"/>
       </w:pPr>
       <w:r>
-        <w:t>During the term of your training with the Company, you shall not, directly or indirectly, whether as an employee, consultant, advisor, partner, investor, or otherwise, engage in any business, assignment, or activity that is competitive with or similar to the business carried on by the Company or any of its affiliates, without obtaining the prior written consent of the Company. During the period of your training, you shall also comply with all non-compete provisions set out in the Company’s Non-Disclosure and Assignment of Inventions Agreement.</w:t>
+        <w:t xml:space="preserve">During the term of your training with the Company, you shall not, directly or indirectly, whether as an employee, consultant, advisor, partner, investor, or otherwise, engage in any business, assignment, or activity that is competitive with or similar to the business carried on by the Company or any of its affiliates, without obtaining the prior written consent of the Company. During the period of your training, you shall also comply with all non-compete provisions set out in the Company’s Non-Disclosure and Assignment of </w:t>
+      </w:r>
+      <w:r>
+        <w:lastRenderedPageBreak/>
+        <w:t>Inventions Agreement.</w:t>
       </w:r>
     </w:p>
     <w:p>
@@ -1451,7 +1450,13 @@
         <w:t xml:space="preserve"> </w:t>
       </w:r>
       <w:r>
-        <w:t>employed by</w:t>
+        <w:t>employed</w:t>
+      </w:r>
+      <w:r>
+        <w:t>/engaged</w:t>
+      </w:r>
+      <w:r>
+        <w:t xml:space="preserve"> by</w:t>
       </w:r>
       <w:r>
         <w:rPr>
@@ -1784,6 +1789,12 @@
         </w:rPr>
         <w:t>d</w:t>
       </w:r>
+      <w:r>
+        <w:rPr>
+          <w:rFonts w:eastAsia="Tahoma"/>
+        </w:rPr>
+        <w:t>.</w:t>
+      </w:r>
     </w:p>
     <w:p>
       <w:pPr>
@@ -2217,6 +2228,7 @@
           <w:sz w:val="22"/>
           <w:szCs w:val="22"/>
         </w:rPr>
+        <w:lastRenderedPageBreak/>
         <w:t>All</w:t>
       </w:r>
       <w:r>
@@ -2661,6 +2673,11 @@
       </w:r>
     </w:p>
     <w:p>
+      <w:pPr>
+        <w:rPr>
+          <w:spacing w:val="-15"/>
+        </w:rPr>
+      </w:pPr>
       <w:r>
         <w:t>If</w:t>
       </w:r>
@@ -2779,7 +2796,13 @@
         <w:t xml:space="preserve"> </w:t>
       </w:r>
       <w:r>
-        <w:t>the Employee: Attention</w:t>
+        <w:t>the</w:t>
+      </w:r>
+      <w:r>
+        <w:t xml:space="preserve"> Trainee</w:t>
+      </w:r>
+      <w:r>
+        <w:t>: Attention</w:t>
       </w:r>
       <w:r>
         <w:rPr>
@@ -2843,7 +2866,19 @@
         <w:t xml:space="preserve"> </w:t>
       </w:r>
       <w:r>
-        <w:t>or by mail to the address as provided in this Clause, or if delivered by electronic mail to the email address as provided in this Clause, shall be deemed given upon delivery. The Company and the Employee from</w:t>
+        <w:t xml:space="preserve">or by mail to the address as provided in this Clause, or if delivered by electronic mail to the email address as provided in this Clause, shall be deemed given upon delivery. The Company </w:t>
+      </w:r>
+      <w:r>
+        <w:t>or</w:t>
+      </w:r>
+      <w:r>
+        <w:t xml:space="preserve"> the </w:t>
+      </w:r>
+      <w:r>
+        <w:t>Trainee</w:t>
+      </w:r>
+      <w:r>
+        <w:t xml:space="preserve"> from</w:t>
       </w:r>
       <w:r>
         <w:rPr>
@@ -2945,7 +2980,7 @@
         <w:rPr>
           <w:spacing w:val="-15"/>
         </w:rPr>
-        <w:t>notifying that</w:t>
+        <w:t>notifying</w:t>
       </w:r>
       <w:r>
         <w:rPr>
@@ -3078,7 +3113,7 @@
         <w:jc w:val="both"/>
       </w:pPr>
       <w:r>
-        <w:t>If any provision of this Appointment Letter and Training Agreement is found to be invalid, void, or unenforceable by a competent authority, that provision will still be fully enforced permitted by law. However, if it cannot be enforced at all, it will be considered severed (removed) from this Appointment Letter and Training Agreement, and the remaining provisions will continue to be fully valid and enforceable. Both parties agree to replace any invalid or unenforceable provision with a valid one that most closely reflects the original intent of the removed provision. If either party chooses not to enforce any right or delays doing so at any time, it will not mean that such Rights have been waived. That party may still exercise the same right later or in any other situation.</w:t>
+        <w:t>If any provision of this Appointment Letter and Training Agreement is found to be invalid, void, or unenforceable by a competent authority, that provision will still be fully enforced permitted by law. However, if it cannot be enforced at all, it will be considered severed (removed) from this Appointment Letter and Training Agreement, and the remaining provisions will continue to be fully valid and enforceable. Both parties agree to replace any invalid or unenforceable provision with a valid one that most closely reflects the original intent of the removed provision. If either party chooses not to enforce any right or delays doing so at any time, it will not mean that such Rights have waived. That party may still exercise the same right later or in any other situation.</w:t>
       </w:r>
     </w:p>
     <w:p>
@@ -3175,7 +3210,13 @@
       </w:r>
       <w:proofErr w:type="gramEnd"/>
       <w:r>
-        <w:t xml:space="preserve"> confirm that all information provided by you to us is accurate and complete to the best of your knowledge, and that you have not misrepresented or willfully concealed any material information regarding your employment history or personal background that could be relevant to your appointment.</w:t>
+        <w:t xml:space="preserve"> confirm that all information provided by you to us is accurate and complete to the best of your knowledge, and that you have not misrepresented or willfully concealed any material information regarding your</w:t>
+      </w:r>
+      <w:r>
+        <w:t xml:space="preserve"> professional </w:t>
+      </w:r>
+      <w:r>
+        <w:t>history or personal background that could be relevant to your appointment.</w:t>
       </w:r>
     </w:p>
     <w:p>
@@ -4553,7 +4594,6 @@
   <w:style w:type="character" w:default="1" w:styleId="DefaultParagraphFont">
     <w:name w:val="Default Paragraph Font"/>
     <w:uiPriority w:val="1"/>
-    <w:semiHidden/>
     <w:unhideWhenUsed/>
   </w:style>
   <w:style w:type="table" w:default="1" w:styleId="TableNormal">
@@ -5023,6 +5063,32 @@
       <w14:ligatures w14:val="none"/>
     </w:rPr>
   </w:style>
+  <w:style w:type="paragraph" w:styleId="HTMLPreformatted">
+    <w:name w:val="HTML Preformatted"/>
+    <w:basedOn w:val="Normal"/>
+    <w:link w:val="HTMLPreformattedChar"/>
+    <w:uiPriority w:val="99"/>
+    <w:semiHidden/>
+    <w:unhideWhenUsed/>
+    <w:rsid w:val="009D4FA8"/>
+    <w:rPr>
+      <w:rFonts w:ascii="Consolas" w:hAnsi="Consolas"/>
+      <w:sz w:val="20"/>
+      <w:szCs w:val="20"/>
+    </w:rPr>
+  </w:style>
+  <w:style w:type="character" w:customStyle="1" w:styleId="HTMLPreformattedChar">
+    <w:name w:val="HTML Preformatted Char"/>
+    <w:basedOn w:val="DefaultParagraphFont"/>
+    <w:link w:val="HTMLPreformatted"/>
+    <w:uiPriority w:val="99"/>
+    <w:semiHidden/>
+    <w:rsid w:val="009D4FA8"/>
+    <w:rPr>
+      <w:rFonts w:ascii="Consolas" w:eastAsia="Times New Roman" w:hAnsi="Consolas" w:cs="Times New Roman"/>
+      <w:lang w:val="en-US" w:eastAsia="en-US"/>
+    </w:rPr>
+  </w:style>
 </w:styles>
 </file>
 
@@ -5283,6 +5349,30 @@
 </file>
 
 <file path=customXml/item1.xml><?xml version="1.0" encoding="utf-8"?>
+<p:properties xmlns:p="http://schemas.microsoft.com/office/2006/metadata/properties" xmlns:xsi="http://www.w3.org/2001/XMLSchema-instance" xmlns:pc="http://schemas.microsoft.com/office/infopath/2007/PartnerControls">
+  <documentManagement>
+    <TaxCatchAll xmlns="356e901f-47eb-47ce-8e66-808e6286e49f" xsi:nil="true"/>
+    <lcf76f155ced4ddcb4097134ff3c332f xmlns="31ff94d2-d6de-4560-8208-d596f4cc19da">
+      <Terms xmlns="http://schemas.microsoft.com/office/infopath/2007/PartnerControls"/>
+    </lcf76f155ced4ddcb4097134ff3c332f>
+  </documentManagement>
+</p:properties>
+</file>
+
+<file path=customXml/item2.xml><?xml version="1.0" encoding="utf-8"?>
+<?mso-contentType ?>
+<FormTemplates xmlns="http://schemas.microsoft.com/sharepoint/v3/contenttype/forms">
+  <Display>DocumentLibraryForm</Display>
+  <Edit>DocumentLibraryForm</Edit>
+  <New>DocumentLibraryForm</New>
+</FormTemplates>
+</file>
+
+<file path=customXml/item3.xml><?xml version="1.0" encoding="utf-8"?>
+<b:Sources xmlns:b="http://schemas.openxmlformats.org/officeDocument/2006/bibliography" xmlns="http://schemas.openxmlformats.org/officeDocument/2006/bibliography" SelectedStyle="\APASixthEditionOfficeOnline.xsl" StyleName="APA" Version="6"/>
+</file>
+
+<file path=customXml/item4.xml><?xml version="1.0" encoding="utf-8"?>
 <ct:contentTypeSchema xmlns:ct="http://schemas.microsoft.com/office/2006/metadata/contentType" xmlns:ma="http://schemas.microsoft.com/office/2006/metadata/properties/metaAttributes" ct:_="" ma:_="" ma:contentTypeName="Document" ma:contentTypeID="0x010100596F5F72D0BB324FB8D2F90D302CBF8E" ma:contentTypeVersion="14" ma:contentTypeDescription="Create a new document." ma:contentTypeScope="" ma:versionID="51395bf0116c116f07b4204002be72fe">
   <xsd:schema xmlns:xsd="http://www.w3.org/2001/XMLSchema" xmlns:xs="http://www.w3.org/2001/XMLSchema" xmlns:p="http://schemas.microsoft.com/office/2006/metadata/properties" xmlns:ns2="31ff94d2-d6de-4560-8208-d596f4cc19da" xmlns:ns3="356e901f-47eb-47ce-8e66-808e6286e49f" targetNamespace="http://schemas.microsoft.com/office/2006/metadata/properties" ma:root="true" ma:fieldsID="a4c736c3916c2b1e2eff80411f42a817" ns2:_="" ns3:_="">
     <xsd:import namespace="31ff94d2-d6de-4560-8208-d596f4cc19da"/>
@@ -5511,31 +5601,34 @@
 </ct:contentTypeSchema>
 </file>
 
-<file path=customXml/item2.xml><?xml version="1.0" encoding="utf-8"?>
-<b:Sources xmlns:b="http://schemas.openxmlformats.org/officeDocument/2006/bibliography" xmlns="http://schemas.openxmlformats.org/officeDocument/2006/bibliography" SelectedStyle="\APASixthEditionOfficeOnline.xsl" StyleName="APA" Version="6"/>
+<file path=customXml/itemProps1.xml><?xml version="1.0" encoding="utf-8"?>
+<ds:datastoreItem xmlns:ds="http://schemas.openxmlformats.org/officeDocument/2006/customXml" ds:itemID="{7883E2C3-CCE1-4717-BE5E-8B1D565F3415}">
+  <ds:schemaRefs>
+    <ds:schemaRef ds:uri="http://schemas.microsoft.com/office/2006/metadata/properties"/>
+    <ds:schemaRef ds:uri="http://schemas.microsoft.com/office/infopath/2007/PartnerControls"/>
+    <ds:schemaRef ds:uri="356e901f-47eb-47ce-8e66-808e6286e49f"/>
+    <ds:schemaRef ds:uri="31ff94d2-d6de-4560-8208-d596f4cc19da"/>
+  </ds:schemaRefs>
+</ds:datastoreItem>
 </file>
 
-<file path=customXml/item3.xml><?xml version="1.0" encoding="utf-8"?>
-<?mso-contentType ?>
-<FormTemplates xmlns="http://schemas.microsoft.com/sharepoint/v3/contenttype/forms">
-  <Display>DocumentLibraryForm</Display>
-  <Edit>DocumentLibraryForm</Edit>
-  <New>DocumentLibraryForm</New>
-</FormTemplates>
+<file path=customXml/itemProps2.xml><?xml version="1.0" encoding="utf-8"?>
+<ds:datastoreItem xmlns:ds="http://schemas.openxmlformats.org/officeDocument/2006/customXml" ds:itemID="{8E9DE294-534C-4BFB-8111-CAF01004D4DD}">
+  <ds:schemaRefs>
+    <ds:schemaRef ds:uri="http://schemas.microsoft.com/sharepoint/v3/contenttype/forms"/>
+  </ds:schemaRefs>
+</ds:datastoreItem>
 </file>
 
-<file path=customXml/item4.xml><?xml version="1.0" encoding="utf-8"?>
-<p:properties xmlns:p="http://schemas.microsoft.com/office/2006/metadata/properties" xmlns:xsi="http://www.w3.org/2001/XMLSchema-instance" xmlns:pc="http://schemas.microsoft.com/office/infopath/2007/PartnerControls">
-  <documentManagement>
-    <TaxCatchAll xmlns="356e901f-47eb-47ce-8e66-808e6286e49f" xsi:nil="true"/>
-    <lcf76f155ced4ddcb4097134ff3c332f xmlns="31ff94d2-d6de-4560-8208-d596f4cc19da">
-      <Terms xmlns="http://schemas.microsoft.com/office/infopath/2007/PartnerControls"/>
-    </lcf76f155ced4ddcb4097134ff3c332f>
-  </documentManagement>
-</p:properties>
+<file path=customXml/itemProps3.xml><?xml version="1.0" encoding="utf-8"?>
+<ds:datastoreItem xmlns:ds="http://schemas.openxmlformats.org/officeDocument/2006/customXml" ds:itemID="{688DFA95-ED9B-4BF1-9C89-C455323CDB9D}">
+  <ds:schemaRefs>
+    <ds:schemaRef ds:uri="http://schemas.openxmlformats.org/officeDocument/2006/bibliography"/>
+  </ds:schemaRefs>
+</ds:datastoreItem>
 </file>
 
-<file path=customXml/itemProps1.xml><?xml version="1.0" encoding="utf-8"?>
+<file path=customXml/itemProps4.xml><?xml version="1.0" encoding="utf-8"?>
 <ds:datastoreItem xmlns:ds="http://schemas.openxmlformats.org/officeDocument/2006/customXml" ds:itemID="{FE719206-F82B-4EF8-BE41-C47AF4CE56A2}">
   <ds:schemaRefs>
     <ds:schemaRef ds:uri="http://schemas.microsoft.com/office/2006/metadata/contentType"/>
@@ -5552,31 +5645,4 @@
     <ds:schemaRef ds:uri="http://schemas.microsoft.com/internal/obd"/>
   </ds:schemaRefs>
 </ds:datastoreItem>
-</file>
-
-<file path=customXml/itemProps2.xml><?xml version="1.0" encoding="utf-8"?>
-<ds:datastoreItem xmlns:ds="http://schemas.openxmlformats.org/officeDocument/2006/customXml" ds:itemID="{688DFA95-ED9B-4BF1-9C89-C455323CDB9D}">
-  <ds:schemaRefs>
-    <ds:schemaRef ds:uri="http://schemas.openxmlformats.org/officeDocument/2006/bibliography"/>
-  </ds:schemaRefs>
-</ds:datastoreItem>
-</file>
-
-<file path=customXml/itemProps3.xml><?xml version="1.0" encoding="utf-8"?>
-<ds:datastoreItem xmlns:ds="http://schemas.openxmlformats.org/officeDocument/2006/customXml" ds:itemID="{8E9DE294-534C-4BFB-8111-CAF01004D4DD}">
-  <ds:schemaRefs>
-    <ds:schemaRef ds:uri="http://schemas.microsoft.com/sharepoint/v3/contenttype/forms"/>
-  </ds:schemaRefs>
-</ds:datastoreItem>
-</file>
-
-<file path=customXml/itemProps4.xml><?xml version="1.0" encoding="utf-8"?>
-<ds:datastoreItem xmlns:ds="http://schemas.openxmlformats.org/officeDocument/2006/customXml" ds:itemID="{7883E2C3-CCE1-4717-BE5E-8B1D565F3415}">
-  <ds:schemaRefs>
-    <ds:schemaRef ds:uri="http://schemas.microsoft.com/office/2006/metadata/properties"/>
-    <ds:schemaRef ds:uri="http://schemas.microsoft.com/office/infopath/2007/PartnerControls"/>
-    <ds:schemaRef ds:uri="356e901f-47eb-47ce-8e66-808e6286e49f"/>
-    <ds:schemaRef ds:uri="31ff94d2-d6de-4560-8208-d596f4cc19da"/>
-  </ds:schemaRefs>
-</ds:datastoreItem>
 </file>
</xml_diff>